<commit_message>
Refresh resume documents and remove Pearson copies
Update the full-stack and senior-engineer resume files in PDF and Word formats, and remove obsolete Pearson-specific resume versions.
</commit_message>
<xml_diff>
--- a/resume/WORD/RoshanLouhar_FullStackEngineer_Resume.docx
+++ b/resume/WORD/RoshanLouhar_FullStackEngineer_Resume.docx
@@ -91,7 +91,7 @@
           </mc:Choice>
           <mc:Fallback>
             <w:pict>
-              <v:shape w14:anchorId="041D6EB9" id="Graphic 1" o:spid="_x0000_s1026" style="position:absolute;margin-left:0;margin-top:0;width:3.55pt;height:840.8pt;z-index:15730176;visibility:visible;mso-wrap-style:square;mso-wrap-distance-left:0;mso-wrap-distance-top:0;mso-wrap-distance-right:0;mso-wrap-distance-bottom:0;mso-position-horizontal:absolute;mso-position-horizontal-relative:page;mso-position-vertical:absolute;mso-position-vertical-relative:page;v-text-anchor:top" coordsize="45085,10678160" o:gfxdata="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" path="m45085,l,,,10678158r45085,l45085,xe" fillcolor="black" stroked="f">
+              <v:shape w14:anchorId="5CB4A0E3" id="Graphic 1" o:spid="_x0000_s1026" style="position:absolute;margin-left:0;margin-top:0;width:3.55pt;height:840.8pt;z-index:15730176;visibility:visible;mso-wrap-style:square;mso-wrap-distance-left:0;mso-wrap-distance-top:0;mso-wrap-distance-right:0;mso-wrap-distance-bottom:0;mso-position-horizontal:absolute;mso-position-horizontal-relative:page;mso-position-vertical:absolute;mso-position-vertical-relative:page;v-text-anchor:top" coordsize="45085,10678160" o:gfxdata="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" path="m45085,l,,,10678158r45085,l45085,xe" fillcolor="black" stroked="f">
                 <v:path arrowok="t"/>
                 <w10:wrap anchorx="page" anchory="page"/>
               </v:shape>
@@ -214,7 +214,6 @@
         </w:rPr>
         <w:t xml:space="preserve"> </w:t>
       </w:r>
-      <w:proofErr w:type="gramStart"/>
       <w:r>
         <w:rPr>
           <w:rFonts w:ascii="Calibri"/>
@@ -237,7 +236,6 @@
         </w:rPr>
         <w:t>.</w:t>
       </w:r>
-      <w:proofErr w:type="gramEnd"/>
       <w:r>
         <w:rPr>
           <w:rFonts w:ascii="Calibri"/>
@@ -246,7 +244,6 @@
         </w:rPr>
         <w:t xml:space="preserve"> </w:t>
       </w:r>
-      <w:proofErr w:type="gramStart"/>
       <w:r>
         <w:rPr>
           <w:rFonts w:ascii="Calibri"/>
@@ -269,7 +266,6 @@
         </w:rPr>
         <w:t>.</w:t>
       </w:r>
-      <w:proofErr w:type="gramEnd"/>
       <w:r>
         <w:rPr>
           <w:rFonts w:ascii="Calibri"/>
@@ -517,7 +513,7 @@
           </mc:Choice>
           <mc:Fallback>
             <w:pict>
-              <v:shape w14:anchorId="0FD42CA3" id="Graphic 2" o:spid="_x0000_s1026" style="position:absolute;margin-left:20.15pt;margin-top:12.1pt;width:566.8pt;height:1pt;z-index:-15728640;visibility:visible;mso-wrap-style:square;mso-wrap-distance-left:0;mso-wrap-distance-top:0;mso-wrap-distance-right:0;mso-wrap-distance-bottom:0;mso-position-horizontal:absolute;mso-position-horizontal-relative:page;mso-position-vertical:absolute;mso-position-vertical-relative:text;v-text-anchor:top" coordsize="7198359,12700" o:gfxdata="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" path="m7197852,l,,,12192r7197852,l7197852,xe" fillcolor="black" stroked="f">
+              <v:shape w14:anchorId="0D080B62" id="Graphic 2" o:spid="_x0000_s1026" style="position:absolute;margin-left:20.15pt;margin-top:12.1pt;width:566.8pt;height:1pt;z-index:-15728640;visibility:visible;mso-wrap-style:square;mso-wrap-distance-left:0;mso-wrap-distance-top:0;mso-wrap-distance-right:0;mso-wrap-distance-bottom:0;mso-position-horizontal:absolute;mso-position-horizontal-relative:page;mso-position-vertical:absolute;mso-position-vertical-relative:text;v-text-anchor:top" coordsize="7198359,12700" o:gfxdata="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" path="m7197852,l,,,12192r7197852,l7197852,xe" fillcolor="black" stroked="f">
                 <v:path arrowok="t"/>
                 <w10:wrap type="topAndBottom" anchorx="page"/>
               </v:shape>
@@ -593,7 +589,23 @@
           <w:color w:val="333333"/>
           <w:sz w:val="20"/>
         </w:rPr>
-        <w:t xml:space="preserve">11+ years </w:t>
+        <w:t>1</w:t>
+      </w:r>
+      <w:r>
+        <w:rPr>
+          <w:b/>
+          <w:color w:val="333333"/>
+          <w:sz w:val="20"/>
+        </w:rPr>
+        <w:t>2</w:t>
+      </w:r>
+      <w:r>
+        <w:rPr>
+          <w:b/>
+          <w:color w:val="333333"/>
+          <w:sz w:val="20"/>
+        </w:rPr>
+        <w:t xml:space="preserve">+ years </w:t>
       </w:r>
       <w:r>
         <w:rPr>
@@ -1008,7 +1020,7 @@
           </mc:Choice>
           <mc:Fallback>
             <w:pict>
-              <v:shape w14:anchorId="1C2D05B5" id="Graphic 3" o:spid="_x0000_s1026" style="position:absolute;margin-left:20.15pt;margin-top:20pt;width:566.8pt;height:1pt;z-index:-15728128;visibility:visible;mso-wrap-style:square;mso-wrap-distance-left:0;mso-wrap-distance-top:0;mso-wrap-distance-right:0;mso-wrap-distance-bottom:0;mso-position-horizontal:absolute;mso-position-horizontal-relative:page;mso-position-vertical:absolute;mso-position-vertical-relative:text;v-text-anchor:top" coordsize="7198359,12700" o:gfxdata="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" path="m7197852,l,,,12192r7197852,l7197852,xe" fillcolor="black" stroked="f">
+              <v:shape w14:anchorId="463A35C7" id="Graphic 3" o:spid="_x0000_s1026" style="position:absolute;margin-left:20.15pt;margin-top:20pt;width:566.8pt;height:1pt;z-index:-15728128;visibility:visible;mso-wrap-style:square;mso-wrap-distance-left:0;mso-wrap-distance-top:0;mso-wrap-distance-right:0;mso-wrap-distance-bottom:0;mso-position-horizontal:absolute;mso-position-horizontal-relative:page;mso-position-vertical:absolute;mso-position-vertical-relative:text;v-text-anchor:top" coordsize="7198359,12700" o:gfxdata="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" path="m7197852,l,,,12192r7197852,l7197852,xe" fillcolor="black" stroked="f">
                 <v:path arrowok="t"/>
                 <w10:wrap type="topAndBottom" anchorx="page"/>
               </v:shape>
@@ -1171,17 +1183,8 @@
           <w:color w:val="333333"/>
           <w:sz w:val="20"/>
         </w:rPr>
-        <w:t>(</w:t>
-      </w:r>
-      <w:proofErr w:type="spellStart"/>
-      <w:r>
-        <w:rPr>
-          <w:color w:val="333333"/>
-          <w:sz w:val="20"/>
-        </w:rPr>
-        <w:t>nUnit</w:t>
-      </w:r>
-      <w:proofErr w:type="spellEnd"/>
+        <w:t>(nUnit</w:t>
+      </w:r>
       <w:r>
         <w:rPr>
           <w:color w:val="333333"/>
@@ -1205,21 +1208,12 @@
         </w:rPr>
         <w:t xml:space="preserve"> </w:t>
       </w:r>
-      <w:proofErr w:type="spellStart"/>
-      <w:r>
-        <w:rPr>
-          <w:color w:val="333333"/>
-          <w:sz w:val="20"/>
-        </w:rPr>
-        <w:t>xUnit</w:t>
-      </w:r>
-      <w:proofErr w:type="spellEnd"/>
-      <w:r>
-        <w:rPr>
-          <w:color w:val="333333"/>
-          <w:sz w:val="20"/>
-        </w:rPr>
-        <w:t>),</w:t>
+      <w:r>
+        <w:rPr>
+          <w:color w:val="333333"/>
+          <w:sz w:val="20"/>
+        </w:rPr>
+        <w:t>xUnit),</w:t>
       </w:r>
       <w:r>
         <w:rPr>
@@ -1631,23 +1625,7 @@
           <w:color w:val="333333"/>
           <w:sz w:val="20"/>
         </w:rPr>
-        <w:t xml:space="preserve">Data Explorer &amp; warehouse, SQL Databases, Cosmos DB, Redis cache, Storage Services, Event streaming services, </w:t>
-      </w:r>
-      <w:proofErr w:type="spellStart"/>
-      <w:r>
-        <w:rPr>
-          <w:color w:val="333333"/>
-          <w:sz w:val="20"/>
-        </w:rPr>
-        <w:t>SignalR</w:t>
-      </w:r>
-      <w:proofErr w:type="spellEnd"/>
-      <w:r>
-        <w:rPr>
-          <w:color w:val="333333"/>
-          <w:sz w:val="20"/>
-        </w:rPr>
-        <w:t>, Docker services.</w:t>
+        <w:t>Data Explorer &amp; warehouse, SQL Databases, Cosmos DB, Redis cache, Storage Services, Event streaming services, SignalR, Docker services.</w:t>
       </w:r>
     </w:p>
     <w:p>
@@ -1961,7 +1939,7 @@
           </mc:Choice>
           <mc:Fallback>
             <w:pict>
-              <v:shape w14:anchorId="1758A699" id="Graphic 4" o:spid="_x0000_s1026" style="position:absolute;margin-left:20.15pt;margin-top:24.15pt;width:566.8pt;height:1pt;z-index:-15727616;visibility:visible;mso-wrap-style:square;mso-wrap-distance-left:0;mso-wrap-distance-top:0;mso-wrap-distance-right:0;mso-wrap-distance-bottom:0;mso-position-horizontal:absolute;mso-position-horizontal-relative:page;mso-position-vertical:absolute;mso-position-vertical-relative:text;v-text-anchor:top" coordsize="7198359,12700" o:gfxdata="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" path="m7197852,l,,,12192r7197852,l7197852,xe" fillcolor="black" stroked="f">
+              <v:shape w14:anchorId="7EDB694D" id="Graphic 4" o:spid="_x0000_s1026" style="position:absolute;margin-left:20.15pt;margin-top:24.15pt;width:566.8pt;height:1pt;z-index:-15727616;visibility:visible;mso-wrap-style:square;mso-wrap-distance-left:0;mso-wrap-distance-top:0;mso-wrap-distance-right:0;mso-wrap-distance-bottom:0;mso-position-horizontal:absolute;mso-position-horizontal-relative:page;mso-position-vertical:absolute;mso-position-vertical-relative:text;v-text-anchor:top" coordsize="7198359,12700" o:gfxdata="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" path="m7197852,l,,,12192r7197852,l7197852,xe" fillcolor="black" stroked="f">
                 <v:path arrowok="t"/>
                 <w10:wrap type="topAndBottom" anchorx="page"/>
               </v:shape>
@@ -2207,15 +2185,7 @@
           <w:color w:val="333333"/>
           <w:sz w:val="20"/>
         </w:rPr>
-        <w:t>Core</w:t>
-      </w:r>
-      <w:proofErr w:type="gramStart"/>
-      <w:r>
-        <w:rPr>
-          <w:color w:val="333333"/>
-          <w:sz w:val="20"/>
-        </w:rPr>
-        <w:t>,</w:t>
+        <w:t>Core,</w:t>
       </w:r>
       <w:r>
         <w:rPr>
@@ -2230,15 +2200,7 @@
           <w:color w:val="333333"/>
           <w:sz w:val="20"/>
         </w:rPr>
-        <w:t>.Net</w:t>
-      </w:r>
-      <w:proofErr w:type="gramEnd"/>
-      <w:r>
-        <w:rPr>
-          <w:color w:val="333333"/>
-          <w:sz w:val="20"/>
-        </w:rPr>
-        <w:t>8,</w:t>
+        <w:t>.Net8,</w:t>
       </w:r>
       <w:r>
         <w:rPr>
@@ -3986,7 +3948,6 @@
         </w:rPr>
         <w:t xml:space="preserve"> </w:t>
       </w:r>
-      <w:proofErr w:type="gramStart"/>
       <w:r>
         <w:rPr>
           <w:color w:val="333333"/>
@@ -3995,7 +3956,6 @@
         </w:rPr>
         <w:t>in</w:t>
       </w:r>
-      <w:proofErr w:type="gramEnd"/>
       <w:r>
         <w:rPr>
           <w:color w:val="333333"/>
@@ -5293,7 +5253,7 @@
           </mc:Choice>
           <mc:Fallback>
             <w:pict>
-              <v:shape w14:anchorId="04E5A9D2" id="Graphic 5" o:spid="_x0000_s1026" style="position:absolute;margin-left:0;margin-top:0;width:3.05pt;height:841.95pt;z-index:15732736;visibility:visible;mso-wrap-style:square;mso-wrap-distance-left:0;mso-wrap-distance-top:0;mso-wrap-distance-right:0;mso-wrap-distance-bottom:0;mso-position-horizontal:absolute;mso-position-horizontal-relative:page;mso-position-vertical:absolute;mso-position-vertical-relative:page;v-text-anchor:top" coordsize="38735,10692765" o:gfxdata="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" path="m38734,l,,,10692382r38734,l38734,xe" fillcolor="black" stroked="f">
+              <v:shape w14:anchorId="04591ABF" id="Graphic 5" o:spid="_x0000_s1026" style="position:absolute;margin-left:0;margin-top:0;width:3.05pt;height:841.95pt;z-index:15732736;visibility:visible;mso-wrap-style:square;mso-wrap-distance-left:0;mso-wrap-distance-top:0;mso-wrap-distance-right:0;mso-wrap-distance-bottom:0;mso-position-horizontal:absolute;mso-position-horizontal-relative:page;mso-position-vertical:absolute;mso-position-vertical-relative:page;v-text-anchor:top" coordsize="38735,10692765" o:gfxdata="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" path="m38734,l,,,10692382r38734,l38734,xe" fillcolor="black" stroked="f">
                 <v:path arrowok="t"/>
                 <w10:wrap anchorx="page" anchory="page"/>
               </v:shape>
@@ -8712,7 +8672,7 @@
           </mc:Choice>
           <mc:Fallback>
             <w:pict>
-              <v:shape w14:anchorId="4351D446" id="Graphic 6" o:spid="_x0000_s1026" style="position:absolute;margin-left:20.15pt;margin-top:12.1pt;width:566.8pt;height:1pt;z-index:-15726592;visibility:visible;mso-wrap-style:square;mso-wrap-distance-left:0;mso-wrap-distance-top:0;mso-wrap-distance-right:0;mso-wrap-distance-bottom:0;mso-position-horizontal:absolute;mso-position-horizontal-relative:page;mso-position-vertical:absolute;mso-position-vertical-relative:text;v-text-anchor:top" coordsize="7198359,12700" o:gfxdata="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" path="m7197852,l,,,12192r7197852,l7197852,xe" fillcolor="black" stroked="f">
+              <v:shape w14:anchorId="455372C1" id="Graphic 6" o:spid="_x0000_s1026" style="position:absolute;margin-left:20.15pt;margin-top:12.1pt;width:566.8pt;height:1pt;z-index:-15726592;visibility:visible;mso-wrap-style:square;mso-wrap-distance-left:0;mso-wrap-distance-top:0;mso-wrap-distance-right:0;mso-wrap-distance-bottom:0;mso-position-horizontal:absolute;mso-position-horizontal-relative:page;mso-position-vertical:absolute;mso-position-vertical-relative:text;v-text-anchor:top" coordsize="7198359,12700" o:gfxdata="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" path="m7197852,l,,,12192r7197852,l7197852,xe" fillcolor="black" stroked="f">
                 <v:path arrowok="t"/>
                 <w10:wrap type="topAndBottom" anchorx="page"/>
               </v:shape>
@@ -9036,21 +8996,7 @@
         <w:rPr>
           <w:color w:val="333333"/>
         </w:rPr>
-        <w:t xml:space="preserve">E-commerce platform for selling books online and managing the warehouse of books from different sources. The backend contains an online automated script that checks and buys books from sources like Amazon, eBay, Valore, and </w:t>
-      </w:r>
-      <w:proofErr w:type="spellStart"/>
-      <w:r>
-        <w:rPr>
-          <w:color w:val="333333"/>
-        </w:rPr>
-        <w:t>AbeBooks</w:t>
-      </w:r>
-      <w:proofErr w:type="spellEnd"/>
-      <w:r>
-        <w:rPr>
-          <w:color w:val="333333"/>
-        </w:rPr>
-        <w:t xml:space="preserve"> using Selenium scripts and updates the warehouse. It also tracks</w:t>
+        <w:t>E-commerce platform for selling books online and managing the warehouse of books from different sources. The backend contains an online automated script that checks and buys books from sources like Amazon, eBay, Valore, and AbeBooks using Selenium scripts and updates the warehouse. It also tracks</w:t>
       </w:r>
       <w:r>
         <w:rPr>
@@ -9205,7 +9151,7 @@
           </mc:Choice>
           <mc:Fallback>
             <w:pict>
-              <v:shape w14:anchorId="13196A2D" id="Graphic 7" o:spid="_x0000_s1026" style="position:absolute;margin-left:20.15pt;margin-top:12.05pt;width:566.8pt;height:1pt;z-index:-15726080;visibility:visible;mso-wrap-style:square;mso-wrap-distance-left:0;mso-wrap-distance-top:0;mso-wrap-distance-right:0;mso-wrap-distance-bottom:0;mso-position-horizontal:absolute;mso-position-horizontal-relative:page;mso-position-vertical:absolute;mso-position-vertical-relative:text;v-text-anchor:top" coordsize="7198359,12700" o:gfxdata="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" path="m7197852,l,,,12192r7197852,l7197852,xe" fillcolor="black" stroked="f">
+              <v:shape w14:anchorId="3A55F1FA" id="Graphic 7" o:spid="_x0000_s1026" style="position:absolute;margin-left:20.15pt;margin-top:12.05pt;width:566.8pt;height:1pt;z-index:-15726080;visibility:visible;mso-wrap-style:square;mso-wrap-distance-left:0;mso-wrap-distance-top:0;mso-wrap-distance-right:0;mso-wrap-distance-bottom:0;mso-position-horizontal:absolute;mso-position-horizontal-relative:page;mso-position-vertical:absolute;mso-position-vertical-relative:text;v-text-anchor:top" coordsize="7198359,12700" o:gfxdata="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" path="m7197852,l,,,12192r7197852,l7197852,xe" fillcolor="black" stroked="f">
                 <v:path arrowok="t"/>
                 <w10:wrap type="topAndBottom" anchorx="page"/>
               </v:shape>
@@ -9506,7 +9452,7 @@
           </mc:Choice>
           <mc:Fallback>
             <w:pict>
-              <v:shape w14:anchorId="7E59F2B8" id="Graphic 8" o:spid="_x0000_s1026" style="position:absolute;margin-left:20.15pt;margin-top:12.05pt;width:566.8pt;height:1pt;z-index:-15725568;visibility:visible;mso-wrap-style:square;mso-wrap-distance-left:0;mso-wrap-distance-top:0;mso-wrap-distance-right:0;mso-wrap-distance-bottom:0;mso-position-horizontal:absolute;mso-position-horizontal-relative:page;mso-position-vertical:absolute;mso-position-vertical-relative:text;v-text-anchor:top" coordsize="7198359,12700" o:gfxdata="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" path="m7197852,l,,,12192r7197852,l7197852,xe" fillcolor="black" stroked="f">
+              <v:shape w14:anchorId="3E9303EC" id="Graphic 8" o:spid="_x0000_s1026" style="position:absolute;margin-left:20.15pt;margin-top:12.05pt;width:566.8pt;height:1pt;z-index:-15725568;visibility:visible;mso-wrap-style:square;mso-wrap-distance-left:0;mso-wrap-distance-top:0;mso-wrap-distance-right:0;mso-wrap-distance-bottom:0;mso-position-horizontal:absolute;mso-position-horizontal-relative:page;mso-position-vertical:absolute;mso-position-vertical-relative:text;v-text-anchor:top" coordsize="7198359,12700" o:gfxdata="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" path="m7197852,l,,,12192r7197852,l7197852,xe" fillcolor="black" stroked="f">
                 <v:path arrowok="t"/>
                 <w10:wrap type="topAndBottom" anchorx="page"/>
               </v:shape>
@@ -9534,7 +9480,6 @@
         <w:spacing w:before="149"/>
         <w:ind w:left="149"/>
       </w:pPr>
-      <w:proofErr w:type="gramStart"/>
       <w:r>
         <w:rPr>
           <w:b/>
@@ -9542,7 +9487,6 @@
         </w:rPr>
         <w:t>B.TECH</w:t>
       </w:r>
-      <w:proofErr w:type="gramEnd"/>
       <w:r>
         <w:rPr>
           <w:b/>
@@ -9808,7 +9752,7 @@
           </mc:Choice>
           <mc:Fallback>
             <w:pict>
-              <v:shape w14:anchorId="6BD69066" id="Graphic 9" o:spid="_x0000_s1026" style="position:absolute;margin-left:20.15pt;margin-top:20.95pt;width:566.8pt;height:1pt;z-index:-15725056;visibility:visible;mso-wrap-style:square;mso-wrap-distance-left:0;mso-wrap-distance-top:0;mso-wrap-distance-right:0;mso-wrap-distance-bottom:0;mso-position-horizontal:absolute;mso-position-horizontal-relative:page;mso-position-vertical:absolute;mso-position-vertical-relative:text;v-text-anchor:top" coordsize="7198359,12700" o:gfxdata="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" path="m7197852,l,,,12192r7197852,l7197852,xe" fillcolor="black" stroked="f">
+              <v:shape w14:anchorId="43C70BE4" id="Graphic 9" o:spid="_x0000_s1026" style="position:absolute;margin-left:20.15pt;margin-top:20.95pt;width:566.8pt;height:1pt;z-index:-15725056;visibility:visible;mso-wrap-style:square;mso-wrap-distance-left:0;mso-wrap-distance-top:0;mso-wrap-distance-right:0;mso-wrap-distance-bottom:0;mso-position-horizontal:absolute;mso-position-horizontal-relative:page;mso-position-vertical:absolute;mso-position-vertical-relative:text;v-text-anchor:top" coordsize="7198359,12700" o:gfxdata="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" path="m7197852,l,,,12192r7197852,l7197852,xe" fillcolor="black" stroked="f">
                 <v:path arrowok="t"/>
                 <w10:wrap type="topAndBottom" anchorx="page"/>
               </v:shape>

</xml_diff>